<commit_message>
add recipe rate to logical db diagram & API
</commit_message>
<xml_diff>
--- a/reports/6301 Королева Федорова ЛР 0.docx
+++ b/reports/6301 Королева Федорова ЛР 0.docx
@@ -573,7 +573,15 @@
         <w:t>Цель работы: р</w:t>
       </w:r>
       <w:r>
-        <w:t>азработать концепцию и архитектуру веб-приложения, спроектировать API и создать Git-репозиторий.</w:t>
+        <w:t xml:space="preserve">азработать концепцию и архитектуру веб-приложения, спроектировать API и создать </w:t>
+      </w:r>
+      <w:proofErr w:type="spellStart"/>
+      <w:r>
+        <w:t>Git</w:t>
+      </w:r>
+      <w:proofErr w:type="spellEnd"/>
+      <w:r>
+        <w:t>-репозиторий.</w:t>
       </w:r>
     </w:p>
     <w:p>
@@ -609,7 +617,15 @@
         </w:numPr>
       </w:pPr>
       <w:r>
-        <w:t>Разработать логическую схему базы данных (использование, как минимум, 3-х сущностей и 1-ой связи many-to-many);</w:t>
+        <w:t xml:space="preserve">Разработать логическую схему базы данных (использование, как минимум, 3-х сущностей и 1-ой связи </w:t>
+      </w:r>
+      <w:proofErr w:type="spellStart"/>
+      <w:r>
+        <w:t>many-to-many</w:t>
+      </w:r>
+      <w:proofErr w:type="spellEnd"/>
+      <w:r>
+        <w:t>);</w:t>
       </w:r>
     </w:p>
     <w:p>
@@ -633,7 +649,15 @@
         </w:numPr>
       </w:pPr>
       <w:r>
-        <w:t>Создание Git-репозитория:</w:t>
+        <w:t xml:space="preserve">Создание </w:t>
+      </w:r>
+      <w:proofErr w:type="spellStart"/>
+      <w:r>
+        <w:t>Git</w:t>
+      </w:r>
+      <w:proofErr w:type="spellEnd"/>
+      <w:r>
+        <w:t>-репозитория:</w:t>
       </w:r>
     </w:p>
     <w:p>
@@ -645,7 +669,15 @@
         </w:numPr>
       </w:pPr>
       <w:r>
-        <w:t>Инициализировать репозиторий (рекомендуется использовать GitHub);</w:t>
+        <w:t xml:space="preserve">Инициализировать репозиторий (рекомендуется использовать </w:t>
+      </w:r>
+      <w:proofErr w:type="spellStart"/>
+      <w:r>
+        <w:t>GitHub</w:t>
+      </w:r>
+      <w:proofErr w:type="spellEnd"/>
+      <w:r>
+        <w:t>);</w:t>
       </w:r>
     </w:p>
     <w:p>
@@ -668,8 +700,18 @@
           <w:numId w:val="46"/>
         </w:numPr>
       </w:pPr>
-      <w:r>
-        <w:t>Добавить .gitignore для исключения ненужных файлов (виртуальное окружение, логи, артефакты сборки и т. д.).</w:t>
+      <w:proofErr w:type="gramStart"/>
+      <w:r>
+        <w:t>Добавить .</w:t>
+      </w:r>
+      <w:proofErr w:type="spellStart"/>
+      <w:r>
+        <w:t>gitignore</w:t>
+      </w:r>
+      <w:proofErr w:type="spellEnd"/>
+      <w:proofErr w:type="gramEnd"/>
+      <w:r>
+        <w:t> для исключения ненужных файлов (виртуальное окружение, логи, артефакты сборки и т. д.).</w:t>
       </w:r>
     </w:p>
     <w:p>
@@ -946,18 +988,25 @@
     </w:p>
     <w:p>
       <w:pPr>
+        <w:pStyle w:val="1-"/>
+      </w:pPr>
+    </w:p>
+    <w:p>
+      <w:pPr>
+        <w:pStyle w:val="1-"/>
+      </w:pPr>
+    </w:p>
+    <w:p>
+      <w:pPr>
         <w:pStyle w:val="-"/>
       </w:pPr>
       <w:r>
-        <w:rPr>
-          <w:noProof/>
-        </w:rPr>
         <w:lastRenderedPageBreak/>
         <w:drawing>
-          <wp:inline distT="0" distB="0" distL="0" distR="0" wp14:anchorId="03299E61" wp14:editId="5FA4EDF7">
-            <wp:extent cx="5557035" cy="2987040"/>
-            <wp:effectExtent l="0" t="0" r="5715" b="3810"/>
-            <wp:docPr id="712273015" name="Рисунок 24"/>
+          <wp:inline distT="0" distB="0" distL="0" distR="0" wp14:anchorId="1234C98C" wp14:editId="7406ED9C">
+            <wp:extent cx="5445125" cy="2948354"/>
+            <wp:effectExtent l="0" t="0" r="3175" b="4445"/>
+            <wp:docPr id="664171598" name="Рисунок 1"/>
             <wp:cNvGraphicFramePr>
               <a:graphicFrameLocks xmlns:a="http://schemas.openxmlformats.org/drawingml/2006/main" noChangeAspect="1"/>
             </wp:cNvGraphicFramePr>
@@ -965,36 +1014,30 @@
               <a:graphicData uri="http://schemas.openxmlformats.org/drawingml/2006/picture">
                 <pic:pic xmlns:pic="http://schemas.openxmlformats.org/drawingml/2006/picture">
                   <pic:nvPicPr>
-                    <pic:cNvPr id="0" name="Picture 3"/>
-                    <pic:cNvPicPr>
-                      <a:picLocks noChangeAspect="1" noChangeArrowheads="1"/>
-                    </pic:cNvPicPr>
+                    <pic:cNvPr id="664171598" name=""/>
+                    <pic:cNvPicPr/>
                   </pic:nvPicPr>
-                  <pic:blipFill>
-                    <a:blip r:embed="rId9">
-                      <a:extLst>
-                        <a:ext uri="{28A0092B-C50C-407E-A947-70E740481C1C}">
-                          <a14:useLocalDpi xmlns:a14="http://schemas.microsoft.com/office/drawing/2010/main" val="0"/>
-                        </a:ext>
-                      </a:extLst>
-                    </a:blip>
-                    <a:srcRect/>
-                    <a:stretch>
-                      <a:fillRect/>
-                    </a:stretch>
+                  <pic:blipFill rotWithShape="1">
+                    <a:blip r:embed="rId9"/>
+                    <a:srcRect t="1" r="8316" b="16390"/>
+                    <a:stretch/>
                   </pic:blipFill>
                   <pic:spPr bwMode="auto">
                     <a:xfrm>
                       <a:off x="0" y="0"/>
-                      <a:ext cx="5557250" cy="2987156"/>
+                      <a:ext cx="5445811" cy="2948725"/>
                     </a:xfrm>
                     <a:prstGeom prst="rect">
                       <a:avLst/>
                     </a:prstGeom>
-                    <a:noFill/>
                     <a:ln>
                       <a:noFill/>
                     </a:ln>
+                    <a:extLst>
+                      <a:ext uri="{53640926-AAD7-44D8-BBD7-CCE9431645EC}">
+                        <a14:shadowObscured xmlns:a14="http://schemas.microsoft.com/office/drawing/2010/main"/>
+                      </a:ext>
+                    </a:extLst>
                   </pic:spPr>
                 </pic:pic>
               </a:graphicData>
@@ -1057,21 +1100,25 @@
       <w:r>
         <w:t xml:space="preserve"> </w:t>
       </w:r>
+      <w:proofErr w:type="spellStart"/>
       <w:r>
         <w:rPr>
           <w:lang w:val="en-US"/>
         </w:rPr>
         <w:t>UserHistory</w:t>
       </w:r>
+      <w:proofErr w:type="spellEnd"/>
       <w:r>
         <w:t xml:space="preserve">, </w:t>
       </w:r>
+      <w:proofErr w:type="spellStart"/>
       <w:r>
         <w:rPr>
           <w:lang w:val="en-US"/>
         </w:rPr>
         <w:t>ListProduct</w:t>
       </w:r>
+      <w:proofErr w:type="spellEnd"/>
       <w:r>
         <w:t xml:space="preserve"> </w:t>
       </w:r>
@@ -1081,12 +1128,14 @@
       <w:r>
         <w:t xml:space="preserve"> </w:t>
       </w:r>
+      <w:proofErr w:type="spellStart"/>
       <w:r>
         <w:rPr>
           <w:lang w:val="en-US"/>
         </w:rPr>
         <w:t>UserProduct</w:t>
       </w:r>
+      <w:proofErr w:type="spellEnd"/>
       <w:r>
         <w:t xml:space="preserve"> </w:t>
       </w:r>
@@ -1201,10 +1250,15 @@
         <w:pStyle w:val="1-"/>
       </w:pPr>
       <w:r>
-        <w:t>/login - GET - получение страницы входа</w:t>
-      </w:r>
-      <w:r>
-        <w:t>.</w:t>
+        <w:t>/</w:t>
+      </w:r>
+      <w:proofErr w:type="spellStart"/>
+      <w:r>
+        <w:t>login</w:t>
+      </w:r>
+      <w:proofErr w:type="spellEnd"/>
+      <w:r>
+        <w:t xml:space="preserve"> - GET - получение страницы входа.</w:t>
       </w:r>
     </w:p>
     <w:p>
@@ -1212,7 +1266,23 @@
         <w:pStyle w:val="1-"/>
       </w:pPr>
       <w:r>
-        <w:t>/login - POST - отправляется при отправке формы, отправляет серверу юзернейм и пароль.</w:t>
+        <w:t>/</w:t>
+      </w:r>
+      <w:proofErr w:type="spellStart"/>
+      <w:r>
+        <w:t>login</w:t>
+      </w:r>
+      <w:proofErr w:type="spellEnd"/>
+      <w:r>
+        <w:t xml:space="preserve"> - POST - отправляется при отправке формы, отправляет серверу </w:t>
+      </w:r>
+      <w:proofErr w:type="spellStart"/>
+      <w:r>
+        <w:t>юзернейм</w:t>
+      </w:r>
+      <w:proofErr w:type="spellEnd"/>
+      <w:r>
+        <w:t xml:space="preserve"> и пароль.</w:t>
       </w:r>
     </w:p>
     <w:p>
@@ -1220,10 +1290,15 @@
         <w:pStyle w:val="1-"/>
       </w:pPr>
       <w:r>
-        <w:t>/signup - GET - получение страницы регистрации</w:t>
-      </w:r>
-      <w:r>
-        <w:t>.</w:t>
+        <w:t>/</w:t>
+      </w:r>
+      <w:proofErr w:type="spellStart"/>
+      <w:r>
+        <w:t>signup</w:t>
+      </w:r>
+      <w:proofErr w:type="spellEnd"/>
+      <w:r>
+        <w:t xml:space="preserve"> - GET - получение страницы регистрации.</w:t>
       </w:r>
     </w:p>
     <w:p>
@@ -1231,7 +1306,23 @@
         <w:pStyle w:val="1-"/>
       </w:pPr>
       <w:r>
-        <w:t>/signup - POST - отправляется при регистрации, отправляет серверу юзернейм и пароль, сервер добавляет в базу нового пользователя.</w:t>
+        <w:t>/</w:t>
+      </w:r>
+      <w:proofErr w:type="spellStart"/>
+      <w:r>
+        <w:t>signup</w:t>
+      </w:r>
+      <w:proofErr w:type="spellEnd"/>
+      <w:r>
+        <w:t xml:space="preserve"> - POST - отправляется при регистрации, отправляет серверу </w:t>
+      </w:r>
+      <w:proofErr w:type="spellStart"/>
+      <w:r>
+        <w:t>юзернейм</w:t>
+      </w:r>
+      <w:proofErr w:type="spellEnd"/>
+      <w:r>
+        <w:t xml:space="preserve"> и пароль, сервер добавляет в базу нового пользователя.</w:t>
       </w:r>
     </w:p>
     <w:p>
@@ -1240,7 +1331,15 @@
       </w:pPr>
       <w:r>
         <w:lastRenderedPageBreak/>
-        <w:t>/recipes - GET - все рецепты, вне зависимости от доступности исходя из количества ингредиентов. Также на этой странице рецепты, на приготовление которых не хватает ингредиентов, будут отмечены специальной надписью или сероватым цветом.</w:t>
+        <w:t>/</w:t>
+      </w:r>
+      <w:proofErr w:type="spellStart"/>
+      <w:r>
+        <w:t>recipes</w:t>
+      </w:r>
+      <w:proofErr w:type="spellEnd"/>
+      <w:r>
+        <w:t xml:space="preserve"> - GET - все рецепты, вне зависимости от доступности исходя из количества ингредиентов. Также на этой странице рецепты, на приготовление которых не хватает ингредиентов, будут отмечены специальной надписью или сероватым цветом.</w:t>
       </w:r>
     </w:p>
     <w:p>
@@ -1248,7 +1347,23 @@
         <w:pStyle w:val="1-"/>
       </w:pPr>
       <w:r>
-        <w:t>/recipes?available=true - GET - доступные рецепты исходя из количества продуктов у авторизованного пользователя.</w:t>
+        <w:t>/</w:t>
+      </w:r>
+      <w:proofErr w:type="spellStart"/>
+      <w:r>
+        <w:t>recipes?available</w:t>
+      </w:r>
+      <w:proofErr w:type="spellEnd"/>
+      <w:r>
+        <w:t>=</w:t>
+      </w:r>
+      <w:proofErr w:type="spellStart"/>
+      <w:r>
+        <w:t>true</w:t>
+      </w:r>
+      <w:proofErr w:type="spellEnd"/>
+      <w:r>
+        <w:t xml:space="preserve"> - GET - доступные рецепты исходя из количества продуктов у авторизованного пользователя.</w:t>
       </w:r>
     </w:p>
     <w:p>
@@ -1256,10 +1371,23 @@
         <w:pStyle w:val="1-"/>
       </w:pPr>
       <w:r>
-        <w:t>/recipes?category_recipe={category_recipe} - GET - показ рецептов с фильтром по категориям</w:t>
-      </w:r>
-      <w:r>
-        <w:t>.</w:t>
+        <w:t>/</w:t>
+      </w:r>
+      <w:proofErr w:type="spellStart"/>
+      <w:r>
+        <w:t>recipes?category_recipe</w:t>
+      </w:r>
+      <w:proofErr w:type="spellEnd"/>
+      <w:r>
+        <w:t>={</w:t>
+      </w:r>
+      <w:proofErr w:type="spellStart"/>
+      <w:r>
+        <w:t>category_recipe</w:t>
+      </w:r>
+      <w:proofErr w:type="spellEnd"/>
+      <w:r>
+        <w:t>} - GET - показ рецептов с фильтром по категориям.</w:t>
       </w:r>
     </w:p>
     <w:p>
@@ -1267,10 +1395,23 @@
         <w:pStyle w:val="1-"/>
       </w:pPr>
       <w:r>
-        <w:t>/recipes?category_product={category_product} - GET - показ рецептов, в которых используются только продукты определенной категории (например, постные или веганские)</w:t>
-      </w:r>
-      <w:r>
-        <w:t>.</w:t>
+        <w:t>/</w:t>
+      </w:r>
+      <w:proofErr w:type="spellStart"/>
+      <w:r>
+        <w:t>recipes?category_product</w:t>
+      </w:r>
+      <w:proofErr w:type="spellEnd"/>
+      <w:r>
+        <w:t>={</w:t>
+      </w:r>
+      <w:proofErr w:type="spellStart"/>
+      <w:r>
+        <w:t>category_product</w:t>
+      </w:r>
+      <w:proofErr w:type="spellEnd"/>
+      <w:r>
+        <w:t>} - GET - показ рецептов, в которых используются только продукты определенной категории (например, постные или веганские).</w:t>
       </w:r>
     </w:p>
     <w:p>
@@ -1278,10 +1419,23 @@
         <w:pStyle w:val="1-"/>
       </w:pPr>
       <w:r>
-        <w:t>/recipies/{id_recipe} - GET - страничка конкретного рецепта с описанием приготовления</w:t>
-      </w:r>
-      <w:r>
-        <w:t>.</w:t>
+        <w:t>/</w:t>
+      </w:r>
+      <w:proofErr w:type="spellStart"/>
+      <w:r>
+        <w:t>recipies</w:t>
+      </w:r>
+      <w:proofErr w:type="spellEnd"/>
+      <w:r>
+        <w:t>/{</w:t>
+      </w:r>
+      <w:proofErr w:type="spellStart"/>
+      <w:r>
+        <w:t>id_recipe</w:t>
+      </w:r>
+      <w:proofErr w:type="spellEnd"/>
+      <w:r>
+        <w:t>} - GET - страничка конкретного рецепта с описанием приготовления.</w:t>
       </w:r>
     </w:p>
     <w:p>
@@ -1289,7 +1443,31 @@
         <w:pStyle w:val="1-"/>
       </w:pPr>
       <w:r>
-        <w:t>/recipes/{id_recipe} - POST - если ингридиентов хватает для приготовления, на данной странице находится кнопка "Приготовить", по нажатию на которую отправляется POST-запрос, заносится информация о приготовленном рецепте в историю приготовления, а также уменьшается количество продуктов в хранилище.</w:t>
+        <w:t>/</w:t>
+      </w:r>
+      <w:proofErr w:type="spellStart"/>
+      <w:r>
+        <w:t>recipes</w:t>
+      </w:r>
+      <w:proofErr w:type="spellEnd"/>
+      <w:r>
+        <w:t>/{</w:t>
+      </w:r>
+      <w:proofErr w:type="spellStart"/>
+      <w:r>
+        <w:t>id_recipe</w:t>
+      </w:r>
+      <w:proofErr w:type="spellEnd"/>
+      <w:r>
+        <w:t xml:space="preserve">} - POST - если </w:t>
+      </w:r>
+      <w:proofErr w:type="spellStart"/>
+      <w:r>
+        <w:t>ингридиентов</w:t>
+      </w:r>
+      <w:proofErr w:type="spellEnd"/>
+      <w:r>
+        <w:t xml:space="preserve"> хватает для приготовления, на данной странице находится кнопка "Приготовить", по нажатию на которую отправляется POST-запрос, заносится информация о приготовленном рецепте в историю приготовления, а также уменьшается количество продуктов в хранилище.</w:t>
       </w:r>
     </w:p>
     <w:p>
@@ -1297,7 +1475,15 @@
         <w:pStyle w:val="1-"/>
       </w:pPr>
       <w:r>
-        <w:t>/products - GET - получение списка продуктов авторизованного пользователя с количеством.</w:t>
+        <w:t>/</w:t>
+      </w:r>
+      <w:proofErr w:type="spellStart"/>
+      <w:r>
+        <w:t>products</w:t>
+      </w:r>
+      <w:proofErr w:type="spellEnd"/>
+      <w:r>
+        <w:t xml:space="preserve"> - GET - получение списка продуктов авторизованного пользователя с количеством.</w:t>
       </w:r>
     </w:p>
     <w:p>
@@ -1305,23 +1491,94 @@
         <w:pStyle w:val="1-"/>
       </w:pPr>
       <w:r>
-        <w:t>/products - POST - отправка формы после того, как пользователь изменил количество продуктов, удалил или добавил новый продукт. При этом в базу данных вносятся соответствующие изменения.</w:t>
-      </w:r>
-    </w:p>
-    <w:p>
-      <w:pPr>
-        <w:pStyle w:val="1-"/>
-      </w:pPr>
-      <w:r>
-        <w:t>/history - GET - история приготовленных рецептов конкретного пользователя.</w:t>
+        <w:t>/</w:t>
+      </w:r>
+      <w:proofErr w:type="spellStart"/>
+      <w:r>
+        <w:t>products</w:t>
+      </w:r>
+      <w:proofErr w:type="spellEnd"/>
+      <w:r>
+        <w:t xml:space="preserve"> - POST - отправка формы после того, как пользователь изменил количество продуктов, удалил или добавил новый продукт. При этом в базу данных вносятся соответствующие изменения.</w:t>
       </w:r>
     </w:p>
     <w:p>
       <w:pPr>
         <w:pStyle w:val="2"/>
-      </w:pPr>
-      <w:r>
-        <w:t>Создание Git-репозитория:</w:t>
+        <w:numPr>
+          <w:ilvl w:val="0"/>
+          <w:numId w:val="0"/>
+        </w:numPr>
+        <w:ind w:left="709"/>
+        <w:rPr>
+          <w:b w:val="0"/>
+        </w:rPr>
+      </w:pPr>
+      <w:r>
+        <w:rPr>
+          <w:b w:val="0"/>
+        </w:rPr>
+        <w:t>/</w:t>
+      </w:r>
+      <w:proofErr w:type="spellStart"/>
+      <w:r>
+        <w:rPr>
+          <w:b w:val="0"/>
+        </w:rPr>
+        <w:t>history</w:t>
+      </w:r>
+      <w:proofErr w:type="spellEnd"/>
+      <w:r>
+        <w:rPr>
+          <w:b w:val="0"/>
+        </w:rPr>
+        <w:t xml:space="preserve"> - GET - история приготовленных рецептов конкретного пользователя с выставленными оценками.</w:t>
+      </w:r>
+    </w:p>
+    <w:p>
+      <w:pPr>
+        <w:pStyle w:val="2"/>
+        <w:numPr>
+          <w:ilvl w:val="0"/>
+          <w:numId w:val="0"/>
+        </w:numPr>
+        <w:ind w:left="709"/>
+      </w:pPr>
+      <w:r>
+        <w:rPr>
+          <w:b w:val="0"/>
+        </w:rPr>
+        <w:t>/</w:t>
+      </w:r>
+      <w:proofErr w:type="spellStart"/>
+      <w:r>
+        <w:rPr>
+          <w:b w:val="0"/>
+        </w:rPr>
+        <w:t>history</w:t>
+      </w:r>
+      <w:proofErr w:type="spellEnd"/>
+      <w:r>
+        <w:rPr>
+          <w:b w:val="0"/>
+        </w:rPr>
+        <w:t xml:space="preserve"> - POST - выставление оценки блюда пользователем.</w:t>
+      </w:r>
+    </w:p>
+    <w:p>
+      <w:pPr>
+        <w:pStyle w:val="2"/>
+      </w:pPr>
+      <w:r>
+        <w:t xml:space="preserve">Создание </w:t>
+      </w:r>
+      <w:proofErr w:type="spellStart"/>
+      <w:r>
+        <w:t>Git</w:t>
+      </w:r>
+      <w:proofErr w:type="spellEnd"/>
+      <w:r>
+        <w:t>-репозитория:</w:t>
       </w:r>
     </w:p>
     <w:p>
@@ -5959,6 +6216,7 @@
   <w:style w:type="character" w:default="1" w:styleId="a2">
     <w:name w:val="Default Paragraph Font"/>
     <w:uiPriority w:val="1"/>
+    <w:semiHidden/>
     <w:unhideWhenUsed/>
   </w:style>
   <w:style w:type="table" w:default="1" w:styleId="a3">

</xml_diff>